<commit_message>
Lab_7 has been completed
</commit_message>
<xml_diff>
--- a/Labs/Lab_7/Lab_7___Speed_Boost_Power-Up.docx
+++ b/Labs/Lab_7/Lab_7___Speed_Boost_Power-Up.docx
@@ -2062,10 +2062,7 @@
       </w:r>
       <w:proofErr w:type="spellEnd"/>
       <w:r>
-        <w:t xml:space="preserve"> is read-only value.</w:t>
-      </w:r>
-      <w:r>
-        <w:t xml:space="preserve"> </w:t>
+        <w:t xml:space="preserve"> is read-only value. </w:t>
       </w:r>
     </w:p>
     <w:p>
@@ -8130,27 +8127,7 @@
           <w:sz w:val="18"/>
           <w:szCs w:val="18"/>
         </w:rPr>
-        <w:t xml:space="preserve"> </w:t>
-      </w:r>
-      <w:proofErr w:type="spellStart"/>
-      <w:r>
-        <w:rPr>
-          <w:rFonts w:ascii="Consolas" w:eastAsia="Consolas" w:hAnsi="Consolas" w:cs="Consolas"/>
-          <w:color w:val="D4D4D4"/>
-          <w:sz w:val="18"/>
-          <w:szCs w:val="18"/>
-        </w:rPr>
-        <w:t>powerUps</w:t>
-      </w:r>
-      <w:proofErr w:type="spellEnd"/>
-      <w:r>
-        <w:rPr>
-          <w:rFonts w:ascii="Consolas" w:eastAsia="Consolas" w:hAnsi="Consolas" w:cs="Consolas"/>
-          <w:color w:val="D4D4D4"/>
-          <w:sz w:val="18"/>
-          <w:szCs w:val="18"/>
-        </w:rPr>
-        <w:t xml:space="preserve"> = </w:t>
+        <w:t xml:space="preserve"> powerUps = </w:t>
       </w:r>
       <w:proofErr w:type="spellStart"/>
       <w:r>
@@ -10763,7 +10740,7 @@
       <w:r>
         <w:t xml:space="preserve">, LORC, </w:t>
       </w:r>
-      <w:hyperlink r:id="rId11" w:history="1">
+      <w:hyperlink r:id="rId11" w:anchor="download" w:history="1">
         <w:r>
           <w:rPr>
             <w:rStyle w:val="Hyperlink"/>
@@ -13713,6 +13690,31 @@
         <w:spacing w:before="200"/>
         <w:ind w:left="1080"/>
       </w:pPr>
+      <w:proofErr w:type="spellStart"/>
+      <w:r>
+        <w:t>SpeedTimeLeft</w:t>
+      </w:r>
+      <w:proofErr w:type="spellEnd"/>
+      <w:r>
+        <w:t xml:space="preserve"> value</w:t>
+      </w:r>
+      <w:r>
+        <w:t xml:space="preserve"> decides whether the icon is visible, and </w:t>
+      </w:r>
+      <w:proofErr w:type="spellStart"/>
+      <w:r>
+        <w:t>PlayerPowerUps</w:t>
+      </w:r>
+      <w:proofErr w:type="spellEnd"/>
+      <w:r>
+        <w:t xml:space="preserve"> </w:t>
+      </w:r>
+      <w:r>
+        <w:t xml:space="preserve">script </w:t>
+      </w:r>
+      <w:r>
+        <w:t>owns the timer.</w:t>
+      </w:r>
       <w:r>
         <w:t xml:space="preserve"> </w:t>
       </w:r>
@@ -13799,6 +13801,15 @@
         <w:spacing w:before="200"/>
         <w:ind w:left="1080"/>
       </w:pPr>
+      <w:r>
+        <w:t>The HUD only reads the timer to stay synchronized with the boost</w:t>
+      </w:r>
+      <w:r>
+        <w:t xml:space="preserve"> timer</w:t>
+      </w:r>
+      <w:r>
+        <w:t>, avoiding a separate timer that could become inaccurate.</w:t>
+      </w:r>
       <w:r>
         <w:t xml:space="preserve"> </w:t>
       </w:r>

</xml_diff>